<commit_message>
Update yang punya laptop
</commit_message>
<xml_diff>
--- a/16. 6 April 2026/Rapat.docx
+++ b/16. 6 April 2026/Rapat.docx
@@ -1,6 +1,6 @@
 
 <file path=word/document.xml><?xml version="1.0" encoding="utf-8"?>
-<w:document xmlns:wpc="http://schemas.microsoft.com/office/word/2010/wordprocessingCanvas" xmlns:cx="http://schemas.microsoft.com/office/drawing/2014/chartex" xmlns:cx1="http://schemas.microsoft.com/office/drawing/2015/9/8/chartex" xmlns:cx2="http://schemas.microsoft.com/office/drawing/2015/10/21/chartex" xmlns:cx3="http://schemas.microsoft.com/office/drawing/2016/5/9/chartex" xmlns:cx4="http://schemas.microsoft.com/office/drawing/2016/5/10/chartex" xmlns:cx5="http://schemas.microsoft.com/office/drawing/2016/5/11/chartex" xmlns:cx6="http://schemas.microsoft.com/office/drawing/2016/5/12/chartex" xmlns:cx7="http://schemas.microsoft.com/office/drawing/2016/5/13/chartex" xmlns:cx8="http://schemas.microsoft.com/office/drawing/2016/5/14/chartex" xmlns:mc="http://schemas.openxmlformats.org/markup-compatibility/2006" xmlns:aink="http://schemas.microsoft.com/office/drawing/2016/ink" xmlns:am3d="http://schemas.microsoft.com/office/drawing/2017/model3d" xmlns:o="urn:schemas-microsoft-com:office:office" xmlns:r="http://schemas.openxmlformats.org/officeDocument/2006/relationships" xmlns:m="http://schemas.openxmlformats.org/officeDocument/2006/math" xmlns:v="urn:schemas-microsoft-com:vml" xmlns:wp14="http://schemas.microsoft.com/office/word/2010/wordprocessingDrawing" xmlns:wp="http://schemas.openxmlformats.org/drawingml/2006/wordprocessingDrawing" xmlns:w10="urn:schemas-microsoft-com:office:word" xmlns:w="http://schemas.openxmlformats.org/wordprocessingml/2006/main" xmlns:w14="http://schemas.microsoft.com/office/word/2010/wordml" xmlns:w15="http://schemas.microsoft.com/office/word/2012/wordml" xmlns:w16cex="http://schemas.microsoft.com/office/word/2018/wordml/cex" xmlns:w16cid="http://schemas.microsoft.com/office/word/2016/wordml/cid" xmlns:w16="http://schemas.microsoft.com/office/word/2018/wordml" xmlns:w16se="http://schemas.microsoft.com/office/word/2015/wordml/symex" xmlns:wpg="http://schemas.microsoft.com/office/word/2010/wordprocessingGroup" xmlns:wpi="http://schemas.microsoft.com/office/word/2010/wordprocessingInk" xmlns:wne="http://schemas.microsoft.com/office/word/2006/wordml" xmlns:wps="http://schemas.microsoft.com/office/word/2010/wordprocessingShape" mc:Ignorable="w14 w15 w16se w16cid w16 w16cex wp14">
+<w:document xmlns:wpc="http://schemas.microsoft.com/office/word/2010/wordprocessingCanvas" xmlns:cx="http://schemas.microsoft.com/office/drawing/2014/chartex" xmlns:cx1="http://schemas.microsoft.com/office/drawing/2015/9/8/chartex" xmlns:cx2="http://schemas.microsoft.com/office/drawing/2015/10/21/chartex" xmlns:cx3="http://schemas.microsoft.com/office/drawing/2016/5/9/chartex" xmlns:cx4="http://schemas.microsoft.com/office/drawing/2016/5/10/chartex" xmlns:cx5="http://schemas.microsoft.com/office/drawing/2016/5/11/chartex" xmlns:cx6="http://schemas.microsoft.com/office/drawing/2016/5/12/chartex" xmlns:cx7="http://schemas.microsoft.com/office/drawing/2016/5/13/chartex" xmlns:cx8="http://schemas.microsoft.com/office/drawing/2016/5/14/chartex" xmlns:mc="http://schemas.openxmlformats.org/markup-compatibility/2006" xmlns:aink="http://schemas.microsoft.com/office/drawing/2016/ink" xmlns:am3d="http://schemas.microsoft.com/office/drawing/2017/model3d" xmlns:o="urn:schemas-microsoft-com:office:office" xmlns:oel="http://schemas.microsoft.com/office/2019/extlst" xmlns:r="http://schemas.openxmlformats.org/officeDocument/2006/relationships" xmlns:m="http://schemas.openxmlformats.org/officeDocument/2006/math" xmlns:v="urn:schemas-microsoft-com:vml" xmlns:wp14="http://schemas.microsoft.com/office/word/2010/wordprocessingDrawing" xmlns:wp="http://schemas.openxmlformats.org/drawingml/2006/wordprocessingDrawing" xmlns:w10="urn:schemas-microsoft-com:office:word" xmlns:w="http://schemas.openxmlformats.org/wordprocessingml/2006/main" xmlns:w14="http://schemas.microsoft.com/office/word/2010/wordml" xmlns:w15="http://schemas.microsoft.com/office/word/2012/wordml" xmlns:w16cex="http://schemas.microsoft.com/office/word/2018/wordml/cex" xmlns:w16cid="http://schemas.microsoft.com/office/word/2016/wordml/cid" xmlns:w16="http://schemas.microsoft.com/office/word/2018/wordml" xmlns:w16du="http://schemas.microsoft.com/office/word/2023/wordml/word16du" xmlns:w16sdtdh="http://schemas.microsoft.com/office/word/2020/wordml/sdtdatahash" xmlns:w16sdtfl="http://schemas.microsoft.com/office/word/2024/wordml/sdtformatlock" xmlns:w16se="http://schemas.microsoft.com/office/word/2015/wordml/symex" xmlns:wpg="http://schemas.microsoft.com/office/word/2010/wordprocessingGroup" xmlns:wpi="http://schemas.microsoft.com/office/word/2010/wordprocessingInk" xmlns:wne="http://schemas.microsoft.com/office/word/2006/wordml" xmlns:wps="http://schemas.microsoft.com/office/word/2010/wordprocessingShape" mc:Ignorable="w14 w15 w16se w16cid w16 w16cex w16sdtdh w16sdtfl w16du wp14">
   <w:body>
     <w:p>
       <w:r>
@@ -8,13 +8,8 @@
       </w:r>
     </w:p>
     <w:p>
-      <w:proofErr w:type="gramStart"/>
-      <w:r>
-        <w:t>Tanggal :</w:t>
-      </w:r>
-      <w:proofErr w:type="gramEnd"/>
-      <w:r>
-        <w:t xml:space="preserve"> Senin, 6 April 2026</w:t>
+      <w:r>
+        <w:t>Tanggal : Senin, 6 April 2026</w:t>
       </w:r>
     </w:p>
     <w:p>
@@ -175,7 +170,6 @@
       <w:r>
         <w:br/>
       </w:r>
-      <w:proofErr w:type="gramStart"/>
       <w:r>
         <w:rPr>
           <mc:AlternateContent>
@@ -195,11 +189,7 @@
         </mc:AlternateContent>
       </w:r>
       <w:r>
-        <w:t xml:space="preserve"> :</w:t>
-      </w:r>
-      <w:proofErr w:type="gramEnd"/>
-      <w:r>
-        <w:t xml:space="preserve"> Memiliki laptop</w:t>
+        <w:t xml:space="preserve"> : Memiliki laptop</w:t>
       </w:r>
       <w:r>
         <w:br/>
@@ -208,13 +198,7 @@
         <w:rPr>
           <w:rFonts w:ascii="Segoe UI Emoji" w:hAnsi="Segoe UI Emoji" w:cs="Segoe UI Emoji"/>
         </w:rPr>
-        <w:t>❌</w:t>
-      </w:r>
-      <w:r>
-        <w:rPr>
-          <w:rFonts w:ascii="Segoe UI Emoji" w:hAnsi="Segoe UI Emoji" w:cs="Segoe UI Emoji"/>
-        </w:rPr>
-        <w:t xml:space="preserve"> : Tidak memiliki laptop</w:t>
+        <w:t>❌ : Tidak memiliki laptop</w:t>
       </w:r>
     </w:p>
     <w:p>
@@ -237,13 +221,8 @@
           <w:numId w:val="1"/>
         </w:numPr>
       </w:pPr>
-      <w:proofErr w:type="gramStart"/>
-      <w:r>
-        <w:t>Pendamping :</w:t>
-      </w:r>
-      <w:proofErr w:type="gramEnd"/>
-      <w:r>
-        <w:t xml:space="preserve"> Ustadz Zen &amp; Ustadzah Rania</w:t>
+      <w:r>
+        <w:t>Pendamping : Ustadz Zen &amp; Ustadzah Rania</w:t>
       </w:r>
     </w:p>
     <w:p>
@@ -1007,6 +986,12 @@
               <w:pStyle w:val="ListParagraph"/>
               <w:ind w:left="0"/>
             </w:pPr>
+            <w:r>
+              <w:rPr>
+                <w:rFonts w:ascii="Segoe UI Emoji" w:hAnsi="Segoe UI Emoji" w:cs="Segoe UI Emoji"/>
+              </w:rPr>
+              <w:t>❌</w:t>
+            </w:r>
           </w:p>
         </w:tc>
         <w:tc>
@@ -1059,13 +1044,8 @@
           <w:numId w:val="1"/>
         </w:numPr>
       </w:pPr>
-      <w:proofErr w:type="gramStart"/>
-      <w:r>
-        <w:t>Pendamping :</w:t>
-      </w:r>
-      <w:proofErr w:type="gramEnd"/>
-      <w:r>
-        <w:t xml:space="preserve"> Ustadz Zaki &amp; Ustadzah Rahmah</w:t>
+      <w:r>
+        <w:t>Pendamping : Ustadz Zaki &amp; Ustadzah Rahmah</w:t>
       </w:r>
     </w:p>
     <w:p>
@@ -1423,10 +1403,7 @@
               <w:ind w:left="0"/>
             </w:pPr>
             <w:r>
-              <w:t>Hanif</w:t>
-            </w:r>
-            <w:r>
-              <w:t xml:space="preserve"> Syaifullaoh</w:t>
+              <w:t>Hanif Syaifullaoh</w:t>
             </w:r>
           </w:p>
         </w:tc>
@@ -1495,10 +1472,7 @@
               <w:ind w:left="0"/>
             </w:pPr>
             <w:r>
-              <w:t>Ifroyim</w:t>
-            </w:r>
-            <w:r>
-              <w:t xml:space="preserve"> Habibullah Fatah</w:t>
+              <w:t>Ifroyim Habibullah Fatah</w:t>
             </w:r>
           </w:p>
         </w:tc>
@@ -1555,13 +1529,7 @@
               <w:ind w:left="0"/>
             </w:pPr>
             <w:r>
-              <w:t xml:space="preserve">Ahmad Abdullah </w:t>
-            </w:r>
-            <w:r>
-              <w:t>Kholis</w:t>
-            </w:r>
-            <w:r>
-              <w:t>h</w:t>
+              <w:t>Ahmad Abdullah Kholish</w:t>
             </w:r>
           </w:p>
         </w:tc>
@@ -1643,8 +1611,6 @@
         <w:pStyle w:val="ListParagraph"/>
         <w:ind w:left="1440"/>
       </w:pPr>
-      <w:bookmarkStart w:id="0" w:name="_GoBack"/>
-      <w:bookmarkEnd w:id="0"/>
     </w:p>
     <w:p>
       <w:pPr>
@@ -1790,6 +1756,24 @@
               <w:pStyle w:val="ListParagraph"/>
               <w:ind w:left="0"/>
             </w:pPr>
+            <w:r>
+              <w:rPr>
+                <mc:AlternateContent>
+                  <mc:Choice Requires="w16se"/>
+                  <mc:Fallback>
+                    <w:rFonts w:ascii="Segoe UI Emoji" w:eastAsia="Segoe UI Emoji" w:hAnsi="Segoe UI Emoji" w:cs="Segoe UI Emoji"/>
+                  </mc:Fallback>
+                </mc:AlternateContent>
+              </w:rPr>
+              <mc:AlternateContent>
+                <mc:Choice Requires="w16se">
+                  <w16se:symEx w16se:font="Segoe UI Emoji" w16se:char="1F4BB"/>
+                </mc:Choice>
+                <mc:Fallback>
+                  <w:t>💻</w:t>
+                </mc:Fallback>
+              </mc:AlternateContent>
+            </w:r>
           </w:p>
         </w:tc>
         <w:tc>
@@ -1891,10 +1875,7 @@
               <w:ind w:left="0"/>
             </w:pPr>
             <w:r>
-              <w:t>Aiko</w:t>
-            </w:r>
-            <w:r>
-              <w:t xml:space="preserve"> Zahwa Syarofana</w:t>
+              <w:t>Aiko Zahwa Syarofana</w:t>
             </w:r>
           </w:p>
         </w:tc>
@@ -1951,10 +1932,7 @@
               <w:ind w:left="0"/>
             </w:pPr>
             <w:r>
-              <w:t>Amila</w:t>
-            </w:r>
-            <w:r>
-              <w:t xml:space="preserve"> Nahwal Haq</w:t>
+              <w:t>Amila Nahwal Haq</w:t>
             </w:r>
           </w:p>
         </w:tc>
@@ -2080,10 +2058,7 @@
               <w:ind w:left="0"/>
             </w:pPr>
             <w:r>
-              <w:t>Mirza</w:t>
-            </w:r>
-            <w:r>
-              <w:t xml:space="preserve"> Faeyza Raziq Ramadhan</w:t>
+              <w:t>Mirza Faeyza Raziq Ramadhan</w:t>
             </w:r>
           </w:p>
         </w:tc>
@@ -2347,15 +2322,7 @@
         </w:numPr>
       </w:pPr>
       <w:r>
-        <w:t xml:space="preserve">Kuttab </w:t>
-      </w:r>
-      <w:proofErr w:type="gramStart"/>
-      <w:r>
-        <w:t>putra :</w:t>
-      </w:r>
-      <w:proofErr w:type="gramEnd"/>
-      <w:r>
-        <w:t xml:space="preserve"> </w:t>
+        <w:t xml:space="preserve">Kuttab putra : </w:t>
       </w:r>
       <w:r>
         <w:t>16</w:t>
@@ -2387,13 +2354,8 @@
           <w:numId w:val="1"/>
         </w:numPr>
       </w:pPr>
-      <w:proofErr w:type="gramStart"/>
-      <w:r>
-        <w:t>Tempat :</w:t>
-      </w:r>
-      <w:proofErr w:type="gramEnd"/>
-      <w:r>
-        <w:t xml:space="preserve"> 3.500.000</w:t>
+      <w:r>
+        <w:t>Tempat : 3.500.000</w:t>
       </w:r>
       <w:r>
         <w:t xml:space="preserve"> (tahun lalu)</w:t>
@@ -2548,7 +2510,7 @@
 </file>
 
 <file path=word/numbering.xml><?xml version="1.0" encoding="utf-8"?>
-<w:numbering xmlns:wpc="http://schemas.microsoft.com/office/word/2010/wordprocessingCanvas" xmlns:cx="http://schemas.microsoft.com/office/drawing/2014/chartex" xmlns:cx1="http://schemas.microsoft.com/office/drawing/2015/9/8/chartex" xmlns:cx2="http://schemas.microsoft.com/office/drawing/2015/10/21/chartex" xmlns:cx3="http://schemas.microsoft.com/office/drawing/2016/5/9/chartex" xmlns:cx4="http://schemas.microsoft.com/office/drawing/2016/5/10/chartex" xmlns:cx5="http://schemas.microsoft.com/office/drawing/2016/5/11/chartex" xmlns:cx6="http://schemas.microsoft.com/office/drawing/2016/5/12/chartex" xmlns:cx7="http://schemas.microsoft.com/office/drawing/2016/5/13/chartex" xmlns:cx8="http://schemas.microsoft.com/office/drawing/2016/5/14/chartex" xmlns:mc="http://schemas.openxmlformats.org/markup-compatibility/2006" xmlns:aink="http://schemas.microsoft.com/office/drawing/2016/ink" xmlns:am3d="http://schemas.microsoft.com/office/drawing/2017/model3d" xmlns:o="urn:schemas-microsoft-com:office:office" xmlns:r="http://schemas.openxmlformats.org/officeDocument/2006/relationships" xmlns:m="http://schemas.openxmlformats.org/officeDocument/2006/math" xmlns:v="urn:schemas-microsoft-com:vml" xmlns:wp14="http://schemas.microsoft.com/office/word/2010/wordprocessingDrawing" xmlns:wp="http://schemas.openxmlformats.org/drawingml/2006/wordprocessingDrawing" xmlns:w10="urn:schemas-microsoft-com:office:word" xmlns:w="http://schemas.openxmlformats.org/wordprocessingml/2006/main" xmlns:w14="http://schemas.microsoft.com/office/word/2010/wordml" xmlns:w15="http://schemas.microsoft.com/office/word/2012/wordml" xmlns:w16cex="http://schemas.microsoft.com/office/word/2018/wordml/cex" xmlns:w16cid="http://schemas.microsoft.com/office/word/2016/wordml/cid" xmlns:w16="http://schemas.microsoft.com/office/word/2018/wordml" xmlns:w16se="http://schemas.microsoft.com/office/word/2015/wordml/symex" xmlns:wpg="http://schemas.microsoft.com/office/word/2010/wordprocessingGroup" xmlns:wpi="http://schemas.microsoft.com/office/word/2010/wordprocessingInk" xmlns:wne="http://schemas.microsoft.com/office/word/2006/wordml" xmlns:wps="http://schemas.microsoft.com/office/word/2010/wordprocessingShape" mc:Ignorable="w14 w15 w16se w16cid w16 w16cex wp14">
+<w:numbering xmlns:wpc="http://schemas.microsoft.com/office/word/2010/wordprocessingCanvas" xmlns:cx="http://schemas.microsoft.com/office/drawing/2014/chartex" xmlns:cx1="http://schemas.microsoft.com/office/drawing/2015/9/8/chartex" xmlns:cx2="http://schemas.microsoft.com/office/drawing/2015/10/21/chartex" xmlns:cx3="http://schemas.microsoft.com/office/drawing/2016/5/9/chartex" xmlns:cx4="http://schemas.microsoft.com/office/drawing/2016/5/10/chartex" xmlns:cx5="http://schemas.microsoft.com/office/drawing/2016/5/11/chartex" xmlns:cx6="http://schemas.microsoft.com/office/drawing/2016/5/12/chartex" xmlns:cx7="http://schemas.microsoft.com/office/drawing/2016/5/13/chartex" xmlns:cx8="http://schemas.microsoft.com/office/drawing/2016/5/14/chartex" xmlns:mc="http://schemas.openxmlformats.org/markup-compatibility/2006" xmlns:aink="http://schemas.microsoft.com/office/drawing/2016/ink" xmlns:am3d="http://schemas.microsoft.com/office/drawing/2017/model3d" xmlns:o="urn:schemas-microsoft-com:office:office" xmlns:oel="http://schemas.microsoft.com/office/2019/extlst" xmlns:r="http://schemas.openxmlformats.org/officeDocument/2006/relationships" xmlns:m="http://schemas.openxmlformats.org/officeDocument/2006/math" xmlns:v="urn:schemas-microsoft-com:vml" xmlns:wp14="http://schemas.microsoft.com/office/word/2010/wordprocessingDrawing" xmlns:wp="http://schemas.openxmlformats.org/drawingml/2006/wordprocessingDrawing" xmlns:w10="urn:schemas-microsoft-com:office:word" xmlns:w="http://schemas.openxmlformats.org/wordprocessingml/2006/main" xmlns:w14="http://schemas.microsoft.com/office/word/2010/wordml" xmlns:w15="http://schemas.microsoft.com/office/word/2012/wordml" xmlns:w16cex="http://schemas.microsoft.com/office/word/2018/wordml/cex" xmlns:w16cid="http://schemas.microsoft.com/office/word/2016/wordml/cid" xmlns:w16="http://schemas.microsoft.com/office/word/2018/wordml" xmlns:w16du="http://schemas.microsoft.com/office/word/2023/wordml/word16du" xmlns:w16sdtdh="http://schemas.microsoft.com/office/word/2020/wordml/sdtdatahash" xmlns:w16sdtfl="http://schemas.microsoft.com/office/word/2024/wordml/sdtformatlock" xmlns:w16se="http://schemas.microsoft.com/office/word/2015/wordml/symex" xmlns:wpg="http://schemas.microsoft.com/office/word/2010/wordprocessingGroup" xmlns:wpi="http://schemas.microsoft.com/office/word/2010/wordprocessingInk" xmlns:wne="http://schemas.microsoft.com/office/word/2006/wordml" xmlns:wps="http://schemas.microsoft.com/office/word/2010/wordprocessingShape" mc:Ignorable="w14 w15 w16se w16cid w16 w16cex w16sdtdh w16sdtfl w16du wp14">
   <w:abstractNum w:abstractNumId="0" w15:restartNumberingAfterBreak="0">
     <w:nsid w:val="2F4368F7"/>
     <w:multiLevelType w:val="hybridMultilevel"/>
@@ -2661,14 +2623,14 @@
       </w:rPr>
     </w:lvl>
   </w:abstractNum>
-  <w:num w:numId="1">
+  <w:num w:numId="1" w16cid:durableId="588931269">
     <w:abstractNumId w:val="0"/>
   </w:num>
 </w:numbering>
 </file>
 
 <file path=word/styles.xml><?xml version="1.0" encoding="utf-8"?>
-<w:styles xmlns:mc="http://schemas.openxmlformats.org/markup-compatibility/2006" xmlns:r="http://schemas.openxmlformats.org/officeDocument/2006/relationships" xmlns:w="http://schemas.openxmlformats.org/wordprocessingml/2006/main" xmlns:w14="http://schemas.microsoft.com/office/word/2010/wordml" xmlns:w15="http://schemas.microsoft.com/office/word/2012/wordml" xmlns:w16cex="http://schemas.microsoft.com/office/word/2018/wordml/cex" xmlns:w16cid="http://schemas.microsoft.com/office/word/2016/wordml/cid" xmlns:w16="http://schemas.microsoft.com/office/word/2018/wordml" xmlns:w16se="http://schemas.microsoft.com/office/word/2015/wordml/symex" mc:Ignorable="w14 w15 w16se w16cid w16 w16cex">
+<w:styles xmlns:mc="http://schemas.openxmlformats.org/markup-compatibility/2006" xmlns:r="http://schemas.openxmlformats.org/officeDocument/2006/relationships" xmlns:w="http://schemas.openxmlformats.org/wordprocessingml/2006/main" xmlns:w14="http://schemas.microsoft.com/office/word/2010/wordml" xmlns:w15="http://schemas.microsoft.com/office/word/2012/wordml" xmlns:w16cex="http://schemas.microsoft.com/office/word/2018/wordml/cex" xmlns:w16cid="http://schemas.microsoft.com/office/word/2016/wordml/cid" xmlns:w16="http://schemas.microsoft.com/office/word/2018/wordml" xmlns:w16du="http://schemas.microsoft.com/office/word/2023/wordml/word16du" xmlns:w16sdtdh="http://schemas.microsoft.com/office/word/2020/wordml/sdtdatahash" xmlns:w16sdtfl="http://schemas.microsoft.com/office/word/2024/wordml/sdtformatlock" xmlns:w16se="http://schemas.microsoft.com/office/word/2015/wordml/symex" mc:Ignorable="w14 w15 w16se w16cid w16 w16cex w16sdtdh w16sdtfl w16du">
   <w:docDefaults>
     <w:rPrDefault>
       <w:rPr>

</xml_diff>